<commit_message>
Set all papers to For NEB Approval, stamp drafts confidential, simplify priority + sign-off
- All 42 papers now show as For NEB Approval
- Every drafted .docx now opens with a CONFIDENTIAL / ULAP-internal notice and footer
- Critical priority now displays as High priority (no separate Critical label)
- Removed the 'set your name' header prompt; identity is chosen from the NEB roster at sign-off
- Removed the descriptive 'records approval with name and signature' subtitle line
- Fixed a stale-cache bug: registry updates always show now; only a visitor's own sign-offs/notes/uploads persist locally
- Fixed roll-call row layout so long names no longer wrap letter-by-letter

Co-Authored-By: Claude Sonnet 5 <noreply@anthropic.com>
</commit_message>
<xml_diff>
--- a/drafts/pp-2026-0001.docx
+++ b/drafts/pp-2026-0001.docx
@@ -2,6 +2,33 @@
 <file path=word/document.xml><?xml version="1.0" encoding="utf-8"?>
 <w:document xmlns:mc="http://schemas.openxmlformats.org/markup-compatibility/2006" xmlns:o="urn:schemas-microsoft-com:office:office" xmlns:r="http://schemas.openxmlformats.org/officeDocument/2006/relationships" xmlns:m="http://schemas.openxmlformats.org/officeDocument/2006/math" xmlns:v="urn:schemas-microsoft-com:vml" xmlns:wp="http://schemas.openxmlformats.org/drawingml/2006/wordprocessingDrawing" xmlns:w10="urn:schemas-microsoft-com:office:word" xmlns:w="http://schemas.openxmlformats.org/wordprocessingml/2006/main" xmlns:wne="http://schemas.microsoft.com/office/word/2006/wordml" xmlns:sl="http://schemas.openxmlformats.org/schemaLibrary/2006/main" xmlns:a="http://schemas.openxmlformats.org/drawingml/2006/main" xmlns:pic="http://schemas.openxmlformats.org/drawingml/2006/picture" xmlns:c="http://schemas.openxmlformats.org/drawingml/2006/chart" xmlns:lc="http://schemas.openxmlformats.org/drawingml/2006/lockedCanvas" xmlns:dgm="http://schemas.openxmlformats.org/drawingml/2006/diagram" xmlns:wps="http://schemas.microsoft.com/office/word/2010/wordprocessingShape" xmlns:wpg="http://schemas.microsoft.com/office/word/2010/wordprocessingGroup" xmlns:w14="http://schemas.microsoft.com/office/word/2010/wordml" xmlns:w15="http://schemas.microsoft.com/office/word/2012/wordml" xmlns:w16="http://schemas.microsoft.com/office/word/2018/wordml" xmlns:w16cex="http://schemas.microsoft.com/office/word/2018/wordml/cex" xmlns:w16cid="http://schemas.microsoft.com/office/word/2016/wordml/cid" xmlns="http://schemas.microsoft.com/office/tasks/2019/documenttasks" xmlns:cr="http://schemas.microsoft.com/office/comments/2020/reactions">
   <w:body>
+    <w:p>
+      <w:pPr>
+        <w:jc w:val="left"/>
+      </w:pPr>
+      <w:r>
+        <w:rPr>
+          <w:b/>
+          <w:color w:val="B23B3B"/>
+          <w:sz w:val="22"/>
+        </w:rPr>
+        <w:t>CONFIDENTIAL — ULAP INTERNAL WORKING DRAFT</w:t>
+      </w:r>
+    </w:p>
+    <w:p>
+      <w:pPr>
+        <w:jc w:val="left"/>
+      </w:pPr>
+      <w:r>
+        <w:rPr>
+          <w:i/>
+          <w:color w:val="5A6473"/>
+          <w:sz w:val="18"/>
+        </w:rPr>
+        <w:t>This is an internal working draft of the Union of Local Authorities of the Philippines (ULAP) National Executive Board. It must not be circulated, published, or forwarded outside ULAP without prior approval of the ULAP National Executive Board.</w:t>
+      </w:r>
+    </w:p>
+    <w:p/>
     <w:p>
       <w:pPr>
         <w:spacing w:before="0" w:after="0" w:line="1980" w:lineRule="exact"/>
@@ -863,7 +890,16 @@
   <w:p>
     <w:pPr>
       <w:pStyle w:val="Footer"/>
-    </w:pPr>
+      <w:jc w:val="center"/>
+    </w:pPr>
+    <w:r/>
+    <w:r>
+      <w:rPr>
+        <w:color w:val="8A93A3"/>
+        <w:sz w:val="16"/>
+      </w:rPr>
+      <w:t>ULAP Internal Document — Not for circulation without NEB Board approval</w:t>
+    </w:r>
   </w:p>
 </w:ftr>
 </file>

</xml_diff>